<commit_message>
Remove dependency on GStreamer
</commit_message>
<xml_diff>
--- a/Instructions.docx
+++ b/Instructions.docx
@@ -527,21 +527,21 @@
           <w:sz w:val="22"/>
           <w:szCs w:val="22"/>
         </w:rPr>
-        <w:t xml:space="preserve">two </w:t>
-      </w:r>
-      <w:r>
-        <w:rPr>
-          <w:sz w:val="22"/>
-          <w:szCs w:val="22"/>
-        </w:rPr>
-        <w:t>different</w:t>
-      </w:r>
-      <w:r>
-        <w:rPr>
-          <w:sz w:val="22"/>
-          <w:szCs w:val="22"/>
-        </w:rPr>
-        <w:t xml:space="preserve"> libraries</w:t>
+        <w:t>a</w:t>
+      </w:r>
+      <w:r>
+        <w:rPr>
+          <w:sz w:val="22"/>
+          <w:szCs w:val="22"/>
+        </w:rPr>
+        <w:t xml:space="preserve"> librar</w:t>
+      </w:r>
+      <w:r>
+        <w:rPr>
+          <w:sz w:val="22"/>
+          <w:szCs w:val="22"/>
+        </w:rPr>
+        <w:t>y</w:t>
       </w:r>
       <w:r>
         <w:rPr>
@@ -590,21 +590,7 @@
           <w:sz w:val="22"/>
           <w:szCs w:val="22"/>
         </w:rPr>
-        <w:t xml:space="preserve">the “MQTT” library and then the </w:t>
-      </w:r>
-      <w:r>
-        <w:rPr>
-          <w:sz w:val="22"/>
-          <w:szCs w:val="22"/>
-        </w:rPr>
-        <w:t>“Video 4” librar</w:t>
-      </w:r>
-      <w:r>
-        <w:rPr>
-          <w:sz w:val="22"/>
-          <w:szCs w:val="22"/>
-        </w:rPr>
-        <w:t>y, as shown below:</w:t>
+        <w:t>the “MQTT” library, as shown below:</w:t>
       </w:r>
     </w:p>
     <w:p>
@@ -680,7 +666,6 @@
     <w:p>
       <w:pPr>
         <w:spacing w:after="0" w:line="240" w:lineRule="auto"/>
-        <w:jc w:val="center"/>
         <w:rPr>
           <w:sz w:val="10"/>
           <w:szCs w:val="10"/>
@@ -690,76 +675,6 @@
     <w:p>
       <w:pPr>
         <w:spacing w:after="0" w:line="240" w:lineRule="auto"/>
-        <w:jc w:val="center"/>
-        <w:rPr>
-          <w:sz w:val="10"/>
-          <w:szCs w:val="10"/>
-        </w:rPr>
-      </w:pPr>
-      <w:r>
-        <w:rPr>
-          <w:noProof/>
-          <w:sz w:val="10"/>
-          <w:szCs w:val="10"/>
-        </w:rPr>
-        <w:drawing>
-          <wp:inline distT="0" distB="0" distL="0" distR="0" wp14:anchorId="30EEECF8" wp14:editId="32308C4D">
-            <wp:extent cx="4889681" cy="655562"/>
-            <wp:effectExtent l="0" t="0" r="0" b="5080"/>
-            <wp:docPr id="1866070578" name="Picture 1"/>
-            <wp:cNvGraphicFramePr>
-              <a:graphicFrameLocks xmlns:a="http://schemas.openxmlformats.org/drawingml/2006/main" noChangeAspect="1"/>
-            </wp:cNvGraphicFramePr>
-            <a:graphic xmlns:a="http://schemas.openxmlformats.org/drawingml/2006/main">
-              <a:graphicData uri="http://schemas.openxmlformats.org/drawingml/2006/picture">
-                <pic:pic xmlns:pic="http://schemas.openxmlformats.org/drawingml/2006/picture">
-                  <pic:nvPicPr>
-                    <pic:cNvPr id="1866070578" name=""/>
-                    <pic:cNvPicPr/>
-                  </pic:nvPicPr>
-                  <pic:blipFill rotWithShape="1">
-                    <a:blip r:embed="rId5"/>
-                    <a:srcRect t="57882"/>
-                    <a:stretch>
-                      <a:fillRect/>
-                    </a:stretch>
-                  </pic:blipFill>
-                  <pic:spPr bwMode="auto">
-                    <a:xfrm>
-                      <a:off x="0" y="0"/>
-                      <a:ext cx="5795285" cy="776977"/>
-                    </a:xfrm>
-                    <a:prstGeom prst="rect">
-                      <a:avLst/>
-                    </a:prstGeom>
-                    <a:ln>
-                      <a:noFill/>
-                    </a:ln>
-                    <a:extLst>
-                      <a:ext uri="{53640926-AAD7-44D8-BBD7-CCE9431645EC}">
-                        <a14:shadowObscured xmlns:a14="http://schemas.microsoft.com/office/drawing/2010/main"/>
-                      </a:ext>
-                    </a:extLst>
-                  </pic:spPr>
-                </pic:pic>
-              </a:graphicData>
-            </a:graphic>
-          </wp:inline>
-        </w:drawing>
-      </w:r>
-    </w:p>
-    <w:p>
-      <w:pPr>
-        <w:spacing w:after="0" w:line="240" w:lineRule="auto"/>
-        <w:rPr>
-          <w:sz w:val="10"/>
-          <w:szCs w:val="10"/>
-        </w:rPr>
-      </w:pPr>
-    </w:p>
-    <w:p>
-      <w:pPr>
-        <w:spacing w:after="0" w:line="240" w:lineRule="auto"/>
         <w:jc w:val="both"/>
         <w:rPr>
           <w:sz w:val="22"/>
@@ -792,7 +707,28 @@
           <w:sz w:val="22"/>
           <w:szCs w:val="22"/>
         </w:rPr>
-        <w:t xml:space="preserve"> these two libraries</w:t>
+        <w:t xml:space="preserve"> </w:t>
+      </w:r>
+      <w:r>
+        <w:rPr>
+          <w:sz w:val="22"/>
+          <w:szCs w:val="22"/>
+        </w:rPr>
+        <w:t>this</w:t>
+      </w:r>
+      <w:r>
+        <w:rPr>
+          <w:sz w:val="22"/>
+          <w:szCs w:val="22"/>
+        </w:rPr>
+        <w:t xml:space="preserve"> librar</w:t>
+      </w:r>
+      <w:r>
+        <w:rPr>
+          <w:sz w:val="22"/>
+          <w:szCs w:val="22"/>
+        </w:rPr>
+        <w:t>y</w:t>
       </w:r>
       <w:r>
         <w:rPr>
@@ -1248,7 +1184,15 @@
           <w:sz w:val="22"/>
           <w:szCs w:val="22"/>
         </w:rPr>
-        <w:t>createGraphics</w:t>
+        <w:t>create</w:t>
+      </w:r>
+      <w:r>
+        <w:rPr>
+          <w:rFonts w:ascii="Courier New" w:hAnsi="Courier New" w:cs="Courier New"/>
+          <w:sz w:val="22"/>
+          <w:szCs w:val="22"/>
+        </w:rPr>
+        <w:t>NewFrame</w:t>
       </w:r>
       <w:proofErr w:type="spellEnd"/>
       <w:r>
@@ -1310,17 +1254,22 @@
           <w:sz w:val="22"/>
           <w:szCs w:val="22"/>
         </w:rPr>
-        <w:t xml:space="preserve"> </w:t>
-      </w:r>
-      <w:proofErr w:type="spellStart"/>
-      <w:r>
-        <w:rPr>
-          <w:sz w:val="22"/>
-          <w:szCs w:val="22"/>
-        </w:rPr>
-        <w:t>varable</w:t>
-      </w:r>
-      <w:proofErr w:type="spellEnd"/>
+        <w:t xml:space="preserve"> var</w:t>
+      </w:r>
+      <w:r>
+        <w:rPr>
+          <w:sz w:val="22"/>
+          <w:szCs w:val="22"/>
+        </w:rPr>
+        <w:t>i</w:t>
+      </w:r>
+      <w:r>
+        <w:rPr>
+          <w:sz w:val="22"/>
+          <w:szCs w:val="22"/>
+        </w:rPr>
+        <w:t>able</w:t>
+      </w:r>
       <w:r>
         <w:rPr>
           <w:sz w:val="22"/>
@@ -1635,15 +1584,7 @@
           <w:sz w:val="22"/>
           <w:szCs w:val="22"/>
         </w:rPr>
-        <w:t xml:space="preserve"> </w:t>
-      </w:r>
-      <w:r>
-        <w:rPr>
-          <w:sz w:val="22"/>
-          <w:szCs w:val="22"/>
-        </w:rPr>
-        <w:lastRenderedPageBreak/>
-        <w:t xml:space="preserve">deemed to have changed. Any minor change in brightness (below the threshold) </w:t>
+        <w:t xml:space="preserve"> deemed to have changed. Any minor change in brightness (below the threshold) </w:t>
       </w:r>
       <w:r>
         <w:rPr>
@@ -1805,6 +1746,7 @@
           <w:sz w:val="22"/>
           <w:szCs w:val="22"/>
         </w:rPr>
+        <w:lastRenderedPageBreak/>
         <w:t>In order to</w:t>
       </w:r>
       <w:proofErr w:type="gramEnd"/>
@@ -1924,341 +1866,6 @@
     <w:p>
       <w:pPr>
         <w:spacing w:after="0" w:line="240" w:lineRule="auto"/>
-        <w:jc w:val="both"/>
-        <w:rPr>
-          <w:sz w:val="22"/>
-          <w:szCs w:val="22"/>
-        </w:rPr>
-      </w:pPr>
-    </w:p>
-    <w:p>
-      <w:pPr>
-        <w:spacing w:after="0" w:line="240" w:lineRule="auto"/>
-        <w:jc w:val="both"/>
-        <w:rPr>
-          <w:sz w:val="22"/>
-          <w:szCs w:val="22"/>
-        </w:rPr>
-      </w:pPr>
-      <w:r>
-        <w:rPr>
-          <w:sz w:val="22"/>
-          <w:szCs w:val="22"/>
-        </w:rPr>
-        <w:t>I</w:t>
-      </w:r>
-      <w:r>
-        <w:rPr>
-          <w:sz w:val="22"/>
-          <w:szCs w:val="22"/>
-        </w:rPr>
-        <w:t>mportant n</w:t>
-      </w:r>
-      <w:r>
-        <w:rPr>
-          <w:sz w:val="22"/>
-          <w:szCs w:val="22"/>
-        </w:rPr>
-        <w:t>ote</w:t>
-      </w:r>
-      <w:r>
-        <w:rPr>
-          <w:sz w:val="22"/>
-          <w:szCs w:val="22"/>
-        </w:rPr>
-        <w:t>:</w:t>
-      </w:r>
-      <w:r>
-        <w:rPr>
-          <w:sz w:val="22"/>
-          <w:szCs w:val="22"/>
-        </w:rPr>
-        <w:t xml:space="preserve"> the very first frame </w:t>
-      </w:r>
-      <w:r>
-        <w:rPr>
-          <w:sz w:val="22"/>
-          <w:szCs w:val="22"/>
-        </w:rPr>
-        <w:t xml:space="preserve">that comes from the video stream </w:t>
-      </w:r>
-      <w:r>
-        <w:rPr>
-          <w:sz w:val="22"/>
-          <w:szCs w:val="22"/>
-        </w:rPr>
-        <w:t xml:space="preserve">might be </w:t>
-      </w:r>
-      <w:r>
-        <w:rPr>
-          <w:sz w:val="22"/>
-          <w:szCs w:val="22"/>
-        </w:rPr>
-        <w:t>blank</w:t>
-      </w:r>
-      <w:r>
-        <w:rPr>
-          <w:sz w:val="22"/>
-          <w:szCs w:val="22"/>
-        </w:rPr>
-        <w:t xml:space="preserve"> </w:t>
-      </w:r>
-      <w:r>
-        <w:rPr>
-          <w:sz w:val="22"/>
-          <w:szCs w:val="22"/>
-        </w:rPr>
-        <w:t xml:space="preserve">– this is because the video is being displayed </w:t>
-      </w:r>
-      <w:r>
-        <w:rPr>
-          <w:sz w:val="22"/>
-          <w:szCs w:val="22"/>
-        </w:rPr>
-        <w:t xml:space="preserve">before the </w:t>
-      </w:r>
-      <w:r>
-        <w:rPr>
-          <w:sz w:val="22"/>
-          <w:szCs w:val="22"/>
-        </w:rPr>
-        <w:t xml:space="preserve">underlying </w:t>
-      </w:r>
-      <w:r>
-        <w:rPr>
-          <w:sz w:val="22"/>
-          <w:szCs w:val="22"/>
-        </w:rPr>
-        <w:t xml:space="preserve">video </w:t>
-      </w:r>
-      <w:r>
-        <w:rPr>
-          <w:sz w:val="22"/>
-          <w:szCs w:val="22"/>
-        </w:rPr>
-        <w:t xml:space="preserve">frame </w:t>
-      </w:r>
-      <w:r>
-        <w:rPr>
-          <w:sz w:val="22"/>
-          <w:szCs w:val="22"/>
-        </w:rPr>
-        <w:t>has fully loaded</w:t>
-      </w:r>
-      <w:r>
-        <w:rPr>
-          <w:sz w:val="22"/>
-          <w:szCs w:val="22"/>
-        </w:rPr>
-        <w:t xml:space="preserve">. In this situation, </w:t>
-      </w:r>
-      <w:r>
-        <w:rPr>
-          <w:sz w:val="22"/>
-          <w:szCs w:val="22"/>
-        </w:rPr>
-        <w:t>you might need to use the 2</w:t>
-      </w:r>
-      <w:r>
-        <w:rPr>
-          <w:sz w:val="22"/>
-          <w:szCs w:val="22"/>
-          <w:vertAlign w:val="superscript"/>
-        </w:rPr>
-        <w:t>nd</w:t>
-      </w:r>
-      <w:r>
-        <w:rPr>
-          <w:sz w:val="22"/>
-          <w:szCs w:val="22"/>
-        </w:rPr>
-        <w:t xml:space="preserve"> frame </w:t>
-      </w:r>
-      <w:r>
-        <w:rPr>
-          <w:sz w:val="22"/>
-          <w:szCs w:val="22"/>
-        </w:rPr>
-        <w:t xml:space="preserve">from the video </w:t>
-      </w:r>
-      <w:r>
-        <w:rPr>
-          <w:sz w:val="22"/>
-          <w:szCs w:val="22"/>
-        </w:rPr>
-        <w:t>to initialise the baseline image.</w:t>
-      </w:r>
-      <w:r>
-        <w:rPr>
-          <w:sz w:val="22"/>
-          <w:szCs w:val="22"/>
-        </w:rPr>
-        <w:t xml:space="preserve"> The following code in your draw function will ensure that the second frame of the video is drawn onto your baseline image frame</w:t>
-      </w:r>
-      <w:r>
-        <w:rPr>
-          <w:sz w:val="22"/>
-          <w:szCs w:val="22"/>
-        </w:rPr>
-        <w:t xml:space="preserve"> (note that </w:t>
-      </w:r>
-      <w:proofErr w:type="spellStart"/>
-      <w:r>
-        <w:rPr>
-          <w:rFonts w:ascii="Courier New" w:hAnsi="Courier New" w:cs="Courier New"/>
-          <w:sz w:val="22"/>
-          <w:szCs w:val="22"/>
-        </w:rPr>
-        <w:t>frameCount</w:t>
-      </w:r>
-      <w:proofErr w:type="spellEnd"/>
-      <w:r>
-        <w:rPr>
-          <w:sz w:val="22"/>
-          <w:szCs w:val="22"/>
-        </w:rPr>
-        <w:t xml:space="preserve"> is a built-in variable that you can just use without initialising)</w:t>
-      </w:r>
-      <w:r>
-        <w:rPr>
-          <w:sz w:val="22"/>
-          <w:szCs w:val="22"/>
-        </w:rPr>
-        <w:t>:</w:t>
-      </w:r>
-    </w:p>
-    <w:p>
-      <w:pPr>
-        <w:tabs>
-          <w:tab w:val="left" w:pos="4223"/>
-        </w:tabs>
-        <w:spacing w:after="0" w:line="240" w:lineRule="auto"/>
-        <w:jc w:val="both"/>
-        <w:rPr>
-          <w:sz w:val="10"/>
-          <w:szCs w:val="10"/>
-        </w:rPr>
-      </w:pPr>
-      <w:r>
-        <w:rPr>
-          <w:sz w:val="22"/>
-          <w:szCs w:val="22"/>
-        </w:rPr>
-        <w:tab/>
-      </w:r>
-    </w:p>
-    <w:p>
-      <w:pPr>
-        <w:spacing w:after="0" w:line="240" w:lineRule="auto"/>
-        <w:jc w:val="center"/>
-        <w:rPr>
-          <w:rFonts w:ascii="Courier New" w:hAnsi="Courier New" w:cs="Courier New"/>
-          <w:sz w:val="22"/>
-          <w:szCs w:val="22"/>
-        </w:rPr>
-      </w:pPr>
-      <w:r>
-        <w:rPr>
-          <w:rFonts w:ascii="Courier New" w:hAnsi="Courier New" w:cs="Courier New"/>
-          <w:sz w:val="22"/>
-          <w:szCs w:val="22"/>
-        </w:rPr>
-        <w:t>if((</w:t>
-      </w:r>
-      <w:proofErr w:type="spellStart"/>
-      <w:r>
-        <w:rPr>
-          <w:rFonts w:ascii="Courier New" w:hAnsi="Courier New" w:cs="Courier New"/>
-          <w:sz w:val="22"/>
-          <w:szCs w:val="22"/>
-        </w:rPr>
-        <w:t>frameCount</w:t>
-      </w:r>
-      <w:proofErr w:type="spellEnd"/>
-      <w:r>
-        <w:rPr>
-          <w:rFonts w:ascii="Courier New" w:hAnsi="Courier New" w:cs="Courier New"/>
-          <w:sz w:val="22"/>
-          <w:szCs w:val="22"/>
-        </w:rPr>
-        <w:t>==</w:t>
-      </w:r>
-      <w:proofErr w:type="gramStart"/>
-      <w:r>
-        <w:rPr>
-          <w:rFonts w:ascii="Courier New" w:hAnsi="Courier New" w:cs="Courier New"/>
-          <w:sz w:val="22"/>
-          <w:szCs w:val="22"/>
-        </w:rPr>
-        <w:t>1)|</w:t>
-      </w:r>
-      <w:proofErr w:type="gramEnd"/>
-      <w:r>
-        <w:rPr>
-          <w:rFonts w:ascii="Courier New" w:hAnsi="Courier New" w:cs="Courier New"/>
-          <w:sz w:val="22"/>
-          <w:szCs w:val="22"/>
-        </w:rPr>
-        <w:t>|(</w:t>
-      </w:r>
-      <w:proofErr w:type="spellStart"/>
-      <w:r>
-        <w:rPr>
-          <w:rFonts w:ascii="Courier New" w:hAnsi="Courier New" w:cs="Courier New"/>
-          <w:sz w:val="22"/>
-          <w:szCs w:val="22"/>
-        </w:rPr>
-        <w:t>frameCount</w:t>
-      </w:r>
-      <w:proofErr w:type="spellEnd"/>
-      <w:r>
-        <w:rPr>
-          <w:rFonts w:ascii="Courier New" w:hAnsi="Courier New" w:cs="Courier New"/>
-          <w:sz w:val="22"/>
-          <w:szCs w:val="22"/>
-        </w:rPr>
-        <w:t xml:space="preserve">==2)) </w:t>
-      </w:r>
-      <w:proofErr w:type="spellStart"/>
-      <w:r>
-        <w:rPr>
-          <w:rFonts w:ascii="Courier New" w:hAnsi="Courier New" w:cs="Courier New"/>
-          <w:sz w:val="22"/>
-          <w:szCs w:val="22"/>
-        </w:rPr>
-        <w:t>drawMovieOntoFrame</w:t>
-      </w:r>
-      <w:proofErr w:type="spellEnd"/>
-      <w:r>
-        <w:rPr>
-          <w:rFonts w:ascii="Courier New" w:hAnsi="Courier New" w:cs="Courier New"/>
-          <w:sz w:val="22"/>
-          <w:szCs w:val="22"/>
-        </w:rPr>
-        <w:t>(</w:t>
-      </w:r>
-      <w:proofErr w:type="spellStart"/>
-      <w:r>
-        <w:rPr>
-          <w:rFonts w:ascii="Courier New" w:hAnsi="Courier New" w:cs="Courier New"/>
-          <w:sz w:val="22"/>
-          <w:szCs w:val="22"/>
-        </w:rPr>
-        <w:t>baselineFrame</w:t>
-      </w:r>
-      <w:proofErr w:type="spellEnd"/>
-      <w:r>
-        <w:rPr>
-          <w:rFonts w:ascii="Courier New" w:hAnsi="Courier New" w:cs="Courier New"/>
-          <w:sz w:val="22"/>
-          <w:szCs w:val="22"/>
-        </w:rPr>
-        <w:t>);</w:t>
-      </w:r>
-    </w:p>
-    <w:p>
-      <w:pPr>
-        <w:spacing w:after="0" w:line="240" w:lineRule="auto"/>
         <w:rPr>
           <w:sz w:val="22"/>
           <w:szCs w:val="22"/>
@@ -2818,15 +2425,7 @@
           <w:sz w:val="22"/>
           <w:szCs w:val="22"/>
         </w:rPr>
-        <w:t xml:space="preserve"> mask off the required areas. Note that </w:t>
-      </w:r>
-      <w:r>
-        <w:rPr>
-          <w:sz w:val="22"/>
-          <w:szCs w:val="22"/>
-        </w:rPr>
-        <w:lastRenderedPageBreak/>
-        <w:t>clicking on the video display window with the mouse will print out the [</w:t>
+        <w:t xml:space="preserve"> mask off the required areas. Note that clicking on the video display window with the mouse will print out the [</w:t>
       </w:r>
       <w:proofErr w:type="spellStart"/>
       <w:proofErr w:type="gramStart"/>
@@ -3138,6 +2737,7 @@
           <w:sz w:val="22"/>
           <w:szCs w:val="22"/>
         </w:rPr>
+        <w:lastRenderedPageBreak/>
         <w:t xml:space="preserve">Task </w:t>
       </w:r>
       <w:r>
@@ -4393,7 +3993,6 @@
           <w:sz w:val="22"/>
           <w:szCs w:val="22"/>
         </w:rPr>
-        <w:lastRenderedPageBreak/>
         <w:t xml:space="preserve">Task </w:t>
       </w:r>
       <w:r>
@@ -4739,6 +4338,7 @@
           <w:sz w:val="22"/>
           <w:szCs w:val="22"/>
         </w:rPr>
+        <w:lastRenderedPageBreak/>
         <w:t>Your aim is to be able to print out a message of the form:</w:t>
       </w:r>
     </w:p>
@@ -5350,14 +4950,7 @@
           <w:sz w:val="22"/>
           <w:szCs w:val="22"/>
         </w:rPr>
-        <w:t>inside the junction triangle</w:t>
-      </w:r>
-      <w:r>
-        <w:rPr>
-          <w:sz w:val="22"/>
-          <w:szCs w:val="22"/>
-        </w:rPr>
-        <w:t xml:space="preserve"> at a particular point in time</w:t>
+        <w:t>inside the junction triangle at a particular point in time</w:t>
       </w:r>
       <w:r>
         <w:rPr>
@@ -5478,7 +5071,7 @@
           <w:sz w:val="22"/>
           <w:szCs w:val="22"/>
         </w:rPr>
-        <w:t>video.mp4</w:t>
+        <w:t>car</w:t>
       </w:r>
       <w:r>
         <w:rPr>
@@ -5492,7 +5085,31 @@
           <w:sz w:val="22"/>
           <w:szCs w:val="22"/>
         </w:rPr>
-        <w:t xml:space="preserve">in your code </w:t>
+        <w:t xml:space="preserve">in </w:t>
+      </w:r>
+      <w:r>
+        <w:rPr>
+          <w:sz w:val="22"/>
+          <w:szCs w:val="22"/>
+        </w:rPr>
+        <w:t xml:space="preserve">the call to </w:t>
+      </w:r>
+      <w:proofErr w:type="spellStart"/>
+      <w:r>
+        <w:rPr>
+          <w:rFonts w:ascii="Courier New" w:hAnsi="Courier New" w:cs="Courier New"/>
+          <w:sz w:val="22"/>
+          <w:szCs w:val="22"/>
+        </w:rPr>
+        <w:t>loadVideo</w:t>
+      </w:r>
+      <w:proofErr w:type="spellEnd"/>
+      <w:r>
+        <w:rPr>
+          <w:sz w:val="22"/>
+          <w:szCs w:val="22"/>
+        </w:rPr>
+        <w:t xml:space="preserve"> </w:t>
       </w:r>
       <w:r>
         <w:rPr>
@@ -5511,41 +5128,17 @@
       </w:r>
       <w:r>
         <w:rPr>
-          <w:rFonts w:ascii="Courier New" w:hAnsi="Courier New" w:cs="Courier New"/>
-          <w:sz w:val="22"/>
-          <w:szCs w:val="22"/>
-        </w:rPr>
-        <w:t>.mp4</w:t>
-      </w:r>
-      <w:r>
-        <w:rPr>
-          <w:sz w:val="22"/>
-          <w:szCs w:val="22"/>
-        </w:rPr>
-        <w:t xml:space="preserve"> </w:t>
-      </w:r>
-      <w:proofErr w:type="gramStart"/>
-      <w:r>
-        <w:rPr>
-          <w:sz w:val="22"/>
-          <w:szCs w:val="22"/>
-        </w:rPr>
-        <w:t>in order</w:t>
-      </w:r>
-      <w:r>
-        <w:rPr>
-          <w:sz w:val="22"/>
-          <w:szCs w:val="22"/>
-        </w:rPr>
-        <w:t xml:space="preserve"> to</w:t>
-      </w:r>
-      <w:proofErr w:type="gramEnd"/>
-      <w:r>
-        <w:rPr>
-          <w:sz w:val="22"/>
-          <w:szCs w:val="22"/>
-        </w:rPr>
-        <w:t xml:space="preserve"> load </w:t>
+          <w:sz w:val="22"/>
+          <w:szCs w:val="22"/>
+        </w:rPr>
+        <w:t xml:space="preserve"> in order</w:t>
+      </w:r>
+      <w:r>
+        <w:rPr>
+          <w:sz w:val="22"/>
+          <w:szCs w:val="22"/>
+        </w:rPr>
+        <w:t xml:space="preserve"> to load </w:t>
       </w:r>
       <w:r>
         <w:rPr>
@@ -5856,15 +5449,7 @@
           <w:sz w:val="22"/>
           <w:szCs w:val="22"/>
         </w:rPr>
-        <w:t xml:space="preserve">on a server called </w:t>
-      </w:r>
-      <w:r>
-        <w:rPr>
-          <w:sz w:val="22"/>
-          <w:szCs w:val="22"/>
-        </w:rPr>
-        <w:lastRenderedPageBreak/>
-        <w:t>a “</w:t>
+        <w:t>on a server called a “</w:t>
       </w:r>
       <w:r>
         <w:rPr>
@@ -6034,6 +5619,7 @@
           <w:sz w:val="22"/>
           <w:szCs w:val="22"/>
         </w:rPr>
+        <w:lastRenderedPageBreak/>
         <w:t xml:space="preserve">Your application should </w:t>
       </w:r>
       <w:r>
@@ -7740,7 +7326,6 @@
           <w:sz w:val="22"/>
           <w:szCs w:val="22"/>
         </w:rPr>
-        <w:lastRenderedPageBreak/>
         <w:t xml:space="preserve">Task </w:t>
       </w:r>
       <w:r>
@@ -8303,6 +7888,7 @@
           <w:sz w:val="22"/>
           <w:szCs w:val="22"/>
         </w:rPr>
+        <w:lastRenderedPageBreak/>
         <w:t>[</w:t>
       </w:r>
       <w:r>

</xml_diff>